<commit_message>
Remove test dice header and publish v1.1
</commit_message>
<xml_diff>
--- a/docs/student-backend-exercises-he/02_create_game.docx
+++ b/docs/student-backend-exercises-he/02_create_game.docx
@@ -950,7 +950,39 @@
           <w:sz w:val="19"/>
           <w:szCs w:val="19"/>
         </w:rPr>
-        <w:t xml:space="preserve">  "available_actions": ["roll"],</w:t>
+        <w:t xml:space="preserve">  "available_actions": [</w:t>
+      </w:r>
+    </w:p>
+    <w:p>
+      <w:pPr>
+        <w:shd w:fill="F3F4F6" w:val="clear"/>
+        <w:spacing w:after="0" w:before="0"/>
+        <w:ind w:left="240" w:right="240"/>
+        <w:jc w:val="left"/>
+      </w:pPr>
+      <w:r>
+        <w:rPr>
+          <w:rFonts w:ascii="Consolas" w:cs="Consolas" w:eastAsia="Consolas" w:hAnsi="Consolas"/>
+          <w:sz w:val="19"/>
+          <w:szCs w:val="19"/>
+        </w:rPr>
+        <w:t xml:space="preserve">    "roll"</w:t>
+      </w:r>
+    </w:p>
+    <w:p>
+      <w:pPr>
+        <w:shd w:fill="F3F4F6" w:val="clear"/>
+        <w:spacing w:after="0" w:before="0"/>
+        <w:ind w:left="240" w:right="240"/>
+        <w:jc w:val="left"/>
+      </w:pPr>
+      <w:r>
+        <w:rPr>
+          <w:rFonts w:ascii="Consolas" w:cs="Consolas" w:eastAsia="Consolas" w:hAnsi="Consolas"/>
+          <w:sz w:val="19"/>
+          <w:szCs w:val="19"/>
+        </w:rPr>
+        <w:t xml:space="preserve">  ],</w:t>
       </w:r>
     </w:p>
     <w:p>
@@ -982,23 +1014,247 @@
           <w:sz w:val="19"/>
           <w:szCs w:val="19"/>
         </w:rPr>
-        <w:t xml:space="preserve">    {"id": 1, "name": "Ada", "money": 1500, "position": 0, "is_bankrupt": false, "owned_tile_ids": []},</w:t>
-      </w:r>
-    </w:p>
-    <w:p>
-      <w:pPr>
-        <w:shd w:fill="F3F4F6" w:val="clear"/>
-        <w:spacing w:after="0" w:before="0"/>
-        <w:ind w:left="240" w:right="240"/>
-        <w:jc w:val="left"/>
-      </w:pPr>
-      <w:r>
-        <w:rPr>
-          <w:rFonts w:ascii="Consolas" w:cs="Consolas" w:eastAsia="Consolas" w:hAnsi="Consolas"/>
-          <w:sz w:val="19"/>
-          <w:szCs w:val="19"/>
-        </w:rPr>
-        <w:t xml:space="preserve">    {"id": 2, "name": "Linus", "money": 1500, "position": 0, "is_bankrupt": false, "owned_tile_ids": []}</w:t>
+        <w:t xml:space="preserve">    {</w:t>
+      </w:r>
+    </w:p>
+    <w:p>
+      <w:pPr>
+        <w:shd w:fill="F3F4F6" w:val="clear"/>
+        <w:spacing w:after="0" w:before="0"/>
+        <w:ind w:left="240" w:right="240"/>
+        <w:jc w:val="left"/>
+      </w:pPr>
+      <w:r>
+        <w:rPr>
+          <w:rFonts w:ascii="Consolas" w:cs="Consolas" w:eastAsia="Consolas" w:hAnsi="Consolas"/>
+          <w:sz w:val="19"/>
+          <w:szCs w:val="19"/>
+        </w:rPr>
+        <w:t xml:space="preserve">      "id": 1,</w:t>
+      </w:r>
+    </w:p>
+    <w:p>
+      <w:pPr>
+        <w:shd w:fill="F3F4F6" w:val="clear"/>
+        <w:spacing w:after="0" w:before="0"/>
+        <w:ind w:left="240" w:right="240"/>
+        <w:jc w:val="left"/>
+      </w:pPr>
+      <w:r>
+        <w:rPr>
+          <w:rFonts w:ascii="Consolas" w:cs="Consolas" w:eastAsia="Consolas" w:hAnsi="Consolas"/>
+          <w:sz w:val="19"/>
+          <w:szCs w:val="19"/>
+        </w:rPr>
+        <w:t xml:space="preserve">      "name": "Ada",</w:t>
+      </w:r>
+    </w:p>
+    <w:p>
+      <w:pPr>
+        <w:shd w:fill="F3F4F6" w:val="clear"/>
+        <w:spacing w:after="0" w:before="0"/>
+        <w:ind w:left="240" w:right="240"/>
+        <w:jc w:val="left"/>
+      </w:pPr>
+      <w:r>
+        <w:rPr>
+          <w:rFonts w:ascii="Consolas" w:cs="Consolas" w:eastAsia="Consolas" w:hAnsi="Consolas"/>
+          <w:sz w:val="19"/>
+          <w:szCs w:val="19"/>
+        </w:rPr>
+        <w:t xml:space="preserve">      "money": 1500,</w:t>
+      </w:r>
+    </w:p>
+    <w:p>
+      <w:pPr>
+        <w:shd w:fill="F3F4F6" w:val="clear"/>
+        <w:spacing w:after="0" w:before="0"/>
+        <w:ind w:left="240" w:right="240"/>
+        <w:jc w:val="left"/>
+      </w:pPr>
+      <w:r>
+        <w:rPr>
+          <w:rFonts w:ascii="Consolas" w:cs="Consolas" w:eastAsia="Consolas" w:hAnsi="Consolas"/>
+          <w:sz w:val="19"/>
+          <w:szCs w:val="19"/>
+        </w:rPr>
+        <w:t xml:space="preserve">      "position": 0,</w:t>
+      </w:r>
+    </w:p>
+    <w:p>
+      <w:pPr>
+        <w:shd w:fill="F3F4F6" w:val="clear"/>
+        <w:spacing w:after="0" w:before="0"/>
+        <w:ind w:left="240" w:right="240"/>
+        <w:jc w:val="left"/>
+      </w:pPr>
+      <w:r>
+        <w:rPr>
+          <w:rFonts w:ascii="Consolas" w:cs="Consolas" w:eastAsia="Consolas" w:hAnsi="Consolas"/>
+          <w:sz w:val="19"/>
+          <w:szCs w:val="19"/>
+        </w:rPr>
+        <w:t xml:space="preserve">      "is_bankrupt": false,</w:t>
+      </w:r>
+    </w:p>
+    <w:p>
+      <w:pPr>
+        <w:shd w:fill="F3F4F6" w:val="clear"/>
+        <w:spacing w:after="0" w:before="0"/>
+        <w:ind w:left="240" w:right="240"/>
+        <w:jc w:val="left"/>
+      </w:pPr>
+      <w:r>
+        <w:rPr>
+          <w:rFonts w:ascii="Consolas" w:cs="Consolas" w:eastAsia="Consolas" w:hAnsi="Consolas"/>
+          <w:sz w:val="19"/>
+          <w:szCs w:val="19"/>
+        </w:rPr>
+        <w:t xml:space="preserve">      "owned_tile_ids": []</w:t>
+      </w:r>
+    </w:p>
+    <w:p>
+      <w:pPr>
+        <w:shd w:fill="F3F4F6" w:val="clear"/>
+        <w:spacing w:after="0" w:before="0"/>
+        <w:ind w:left="240" w:right="240"/>
+        <w:jc w:val="left"/>
+      </w:pPr>
+      <w:r>
+        <w:rPr>
+          <w:rFonts w:ascii="Consolas" w:cs="Consolas" w:eastAsia="Consolas" w:hAnsi="Consolas"/>
+          <w:sz w:val="19"/>
+          <w:szCs w:val="19"/>
+        </w:rPr>
+        <w:t xml:space="preserve">    },</w:t>
+      </w:r>
+    </w:p>
+    <w:p>
+      <w:pPr>
+        <w:shd w:fill="F3F4F6" w:val="clear"/>
+        <w:spacing w:after="0" w:before="0"/>
+        <w:ind w:left="240" w:right="240"/>
+        <w:jc w:val="left"/>
+      </w:pPr>
+      <w:r>
+        <w:rPr>
+          <w:rFonts w:ascii="Consolas" w:cs="Consolas" w:eastAsia="Consolas" w:hAnsi="Consolas"/>
+          <w:sz w:val="19"/>
+          <w:szCs w:val="19"/>
+        </w:rPr>
+        <w:t xml:space="preserve">    {</w:t>
+      </w:r>
+    </w:p>
+    <w:p>
+      <w:pPr>
+        <w:shd w:fill="F3F4F6" w:val="clear"/>
+        <w:spacing w:after="0" w:before="0"/>
+        <w:ind w:left="240" w:right="240"/>
+        <w:jc w:val="left"/>
+      </w:pPr>
+      <w:r>
+        <w:rPr>
+          <w:rFonts w:ascii="Consolas" w:cs="Consolas" w:eastAsia="Consolas" w:hAnsi="Consolas"/>
+          <w:sz w:val="19"/>
+          <w:szCs w:val="19"/>
+        </w:rPr>
+        <w:t xml:space="preserve">      "id": 2,</w:t>
+      </w:r>
+    </w:p>
+    <w:p>
+      <w:pPr>
+        <w:shd w:fill="F3F4F6" w:val="clear"/>
+        <w:spacing w:after="0" w:before="0"/>
+        <w:ind w:left="240" w:right="240"/>
+        <w:jc w:val="left"/>
+      </w:pPr>
+      <w:r>
+        <w:rPr>
+          <w:rFonts w:ascii="Consolas" w:cs="Consolas" w:eastAsia="Consolas" w:hAnsi="Consolas"/>
+          <w:sz w:val="19"/>
+          <w:szCs w:val="19"/>
+        </w:rPr>
+        <w:t xml:space="preserve">      "name": "Linus",</w:t>
+      </w:r>
+    </w:p>
+    <w:p>
+      <w:pPr>
+        <w:shd w:fill="F3F4F6" w:val="clear"/>
+        <w:spacing w:after="0" w:before="0"/>
+        <w:ind w:left="240" w:right="240"/>
+        <w:jc w:val="left"/>
+      </w:pPr>
+      <w:r>
+        <w:rPr>
+          <w:rFonts w:ascii="Consolas" w:cs="Consolas" w:eastAsia="Consolas" w:hAnsi="Consolas"/>
+          <w:sz w:val="19"/>
+          <w:szCs w:val="19"/>
+        </w:rPr>
+        <w:t xml:space="preserve">      "money": 1500,</w:t>
+      </w:r>
+    </w:p>
+    <w:p>
+      <w:pPr>
+        <w:shd w:fill="F3F4F6" w:val="clear"/>
+        <w:spacing w:after="0" w:before="0"/>
+        <w:ind w:left="240" w:right="240"/>
+        <w:jc w:val="left"/>
+      </w:pPr>
+      <w:r>
+        <w:rPr>
+          <w:rFonts w:ascii="Consolas" w:cs="Consolas" w:eastAsia="Consolas" w:hAnsi="Consolas"/>
+          <w:sz w:val="19"/>
+          <w:szCs w:val="19"/>
+        </w:rPr>
+        <w:t xml:space="preserve">      "position": 0,</w:t>
+      </w:r>
+    </w:p>
+    <w:p>
+      <w:pPr>
+        <w:shd w:fill="F3F4F6" w:val="clear"/>
+        <w:spacing w:after="0" w:before="0"/>
+        <w:ind w:left="240" w:right="240"/>
+        <w:jc w:val="left"/>
+      </w:pPr>
+      <w:r>
+        <w:rPr>
+          <w:rFonts w:ascii="Consolas" w:cs="Consolas" w:eastAsia="Consolas" w:hAnsi="Consolas"/>
+          <w:sz w:val="19"/>
+          <w:szCs w:val="19"/>
+        </w:rPr>
+        <w:t xml:space="preserve">      "is_bankrupt": false,</w:t>
+      </w:r>
+    </w:p>
+    <w:p>
+      <w:pPr>
+        <w:shd w:fill="F3F4F6" w:val="clear"/>
+        <w:spacing w:after="0" w:before="0"/>
+        <w:ind w:left="240" w:right="240"/>
+        <w:jc w:val="left"/>
+      </w:pPr>
+      <w:r>
+        <w:rPr>
+          <w:rFonts w:ascii="Consolas" w:cs="Consolas" w:eastAsia="Consolas" w:hAnsi="Consolas"/>
+          <w:sz w:val="19"/>
+          <w:szCs w:val="19"/>
+        </w:rPr>
+        <w:t xml:space="preserve">      "owned_tile_ids": []</w:t>
+      </w:r>
+    </w:p>
+    <w:p>
+      <w:pPr>
+        <w:shd w:fill="F3F4F6" w:val="clear"/>
+        <w:spacing w:after="0" w:before="0"/>
+        <w:ind w:left="240" w:right="240"/>
+        <w:jc w:val="left"/>
+      </w:pPr>
+      <w:r>
+        <w:rPr>
+          <w:rFonts w:ascii="Consolas" w:cs="Consolas" w:eastAsia="Consolas" w:hAnsi="Consolas"/>
+          <w:sz w:val="19"/>
+          <w:szCs w:val="19"/>
+        </w:rPr>
+        <w:t xml:space="preserve">    }</w:t>
       </w:r>
     </w:p>
     <w:p>
@@ -1046,23 +1302,1703 @@
           <w:sz w:val="19"/>
           <w:szCs w:val="19"/>
         </w:rPr>
-        <w:t xml:space="preserve">    {"id": 0, "name": "Start", "type": "start"},</w:t>
-      </w:r>
-    </w:p>
-    <w:p>
-      <w:pPr>
-        <w:shd w:fill="F3F4F6" w:val="clear"/>
-        <w:spacing w:after="0" w:before="0"/>
-        <w:ind w:left="240" w:right="240"/>
-        <w:jc w:val="left"/>
-      </w:pPr>
-      <w:r>
-        <w:rPr>
-          <w:rFonts w:ascii="Consolas" w:cs="Consolas" w:eastAsia="Consolas" w:hAnsi="Consolas"/>
-          <w:sz w:val="19"/>
-          <w:szCs w:val="19"/>
-        </w:rPr>
-        <w:t xml:space="preserve">    {"id": 1, "name": "Bakery", "type": "property", "price": 100, "rent": 20, "owner_id": null}</w:t>
+        <w:t xml:space="preserve">    {</w:t>
+      </w:r>
+    </w:p>
+    <w:p>
+      <w:pPr>
+        <w:shd w:fill="F3F4F6" w:val="clear"/>
+        <w:spacing w:after="0" w:before="0"/>
+        <w:ind w:left="240" w:right="240"/>
+        <w:jc w:val="left"/>
+      </w:pPr>
+      <w:r>
+        <w:rPr>
+          <w:rFonts w:ascii="Consolas" w:cs="Consolas" w:eastAsia="Consolas" w:hAnsi="Consolas"/>
+          <w:sz w:val="19"/>
+          <w:szCs w:val="19"/>
+        </w:rPr>
+        <w:t xml:space="preserve">      "id": 0,</w:t>
+      </w:r>
+    </w:p>
+    <w:p>
+      <w:pPr>
+        <w:shd w:fill="F3F4F6" w:val="clear"/>
+        <w:spacing w:after="0" w:before="0"/>
+        <w:ind w:left="240" w:right="240"/>
+        <w:jc w:val="left"/>
+      </w:pPr>
+      <w:r>
+        <w:rPr>
+          <w:rFonts w:ascii="Consolas" w:cs="Consolas" w:eastAsia="Consolas" w:hAnsi="Consolas"/>
+          <w:sz w:val="19"/>
+          <w:szCs w:val="19"/>
+        </w:rPr>
+        <w:t xml:space="preserve">      "name": "נקודת יציאה",</w:t>
+      </w:r>
+    </w:p>
+    <w:p>
+      <w:pPr>
+        <w:shd w:fill="F3F4F6" w:val="clear"/>
+        <w:spacing w:after="0" w:before="0"/>
+        <w:ind w:left="240" w:right="240"/>
+        <w:jc w:val="left"/>
+      </w:pPr>
+      <w:r>
+        <w:rPr>
+          <w:rFonts w:ascii="Consolas" w:cs="Consolas" w:eastAsia="Consolas" w:hAnsi="Consolas"/>
+          <w:sz w:val="19"/>
+          <w:szCs w:val="19"/>
+        </w:rPr>
+        <w:t xml:space="preserve">      "type": "start"</w:t>
+      </w:r>
+    </w:p>
+    <w:p>
+      <w:pPr>
+        <w:shd w:fill="F3F4F6" w:val="clear"/>
+        <w:spacing w:after="0" w:before="0"/>
+        <w:ind w:left="240" w:right="240"/>
+        <w:jc w:val="left"/>
+      </w:pPr>
+      <w:r>
+        <w:rPr>
+          <w:rFonts w:ascii="Consolas" w:cs="Consolas" w:eastAsia="Consolas" w:hAnsi="Consolas"/>
+          <w:sz w:val="19"/>
+          <w:szCs w:val="19"/>
+        </w:rPr>
+        <w:t xml:space="preserve">    },</w:t>
+      </w:r>
+    </w:p>
+    <w:p>
+      <w:pPr>
+        <w:shd w:fill="F3F4F6" w:val="clear"/>
+        <w:spacing w:after="0" w:before="0"/>
+        <w:ind w:left="240" w:right="240"/>
+        <w:jc w:val="left"/>
+      </w:pPr>
+      <w:r>
+        <w:rPr>
+          <w:rFonts w:ascii="Consolas" w:cs="Consolas" w:eastAsia="Consolas" w:hAnsi="Consolas"/>
+          <w:sz w:val="19"/>
+          <w:szCs w:val="19"/>
+        </w:rPr>
+        <w:t xml:space="preserve">    {</w:t>
+      </w:r>
+    </w:p>
+    <w:p>
+      <w:pPr>
+        <w:shd w:fill="F3F4F6" w:val="clear"/>
+        <w:spacing w:after="0" w:before="0"/>
+        <w:ind w:left="240" w:right="240"/>
+        <w:jc w:val="left"/>
+      </w:pPr>
+      <w:r>
+        <w:rPr>
+          <w:rFonts w:ascii="Consolas" w:cs="Consolas" w:eastAsia="Consolas" w:hAnsi="Consolas"/>
+          <w:sz w:val="19"/>
+          <w:szCs w:val="19"/>
+        </w:rPr>
+        <w:t xml:space="preserve">      "id": 1,</w:t>
+      </w:r>
+    </w:p>
+    <w:p>
+      <w:pPr>
+        <w:shd w:fill="F3F4F6" w:val="clear"/>
+        <w:spacing w:after="0" w:before="0"/>
+        <w:ind w:left="240" w:right="240"/>
+        <w:jc w:val="left"/>
+      </w:pPr>
+      <w:r>
+        <w:rPr>
+          <w:rFonts w:ascii="Consolas" w:cs="Consolas" w:eastAsia="Consolas" w:hAnsi="Consolas"/>
+          <w:sz w:val="19"/>
+          <w:szCs w:val="19"/>
+        </w:rPr>
+        <w:t xml:space="preserve">      "name": "ירדן",</w:t>
+      </w:r>
+    </w:p>
+    <w:p>
+      <w:pPr>
+        <w:shd w:fill="F3F4F6" w:val="clear"/>
+        <w:spacing w:after="0" w:before="0"/>
+        <w:ind w:left="240" w:right="240"/>
+        <w:jc w:val="left"/>
+      </w:pPr>
+      <w:r>
+        <w:rPr>
+          <w:rFonts w:ascii="Consolas" w:cs="Consolas" w:eastAsia="Consolas" w:hAnsi="Consolas"/>
+          <w:sz w:val="19"/>
+          <w:szCs w:val="19"/>
+        </w:rPr>
+        <w:t xml:space="preserve">      "type": "property",</w:t>
+      </w:r>
+    </w:p>
+    <w:p>
+      <w:pPr>
+        <w:shd w:fill="F3F4F6" w:val="clear"/>
+        <w:spacing w:after="0" w:before="0"/>
+        <w:ind w:left="240" w:right="240"/>
+        <w:jc w:val="left"/>
+      </w:pPr>
+      <w:r>
+        <w:rPr>
+          <w:rFonts w:ascii="Consolas" w:cs="Consolas" w:eastAsia="Consolas" w:hAnsi="Consolas"/>
+          <w:sz w:val="19"/>
+          <w:szCs w:val="19"/>
+        </w:rPr>
+        <w:t xml:space="preserve">      "price": 100,</w:t>
+      </w:r>
+    </w:p>
+    <w:p>
+      <w:pPr>
+        <w:shd w:fill="F3F4F6" w:val="clear"/>
+        <w:spacing w:after="0" w:before="0"/>
+        <w:ind w:left="240" w:right="240"/>
+        <w:jc w:val="left"/>
+      </w:pPr>
+      <w:r>
+        <w:rPr>
+          <w:rFonts w:ascii="Consolas" w:cs="Consolas" w:eastAsia="Consolas" w:hAnsi="Consolas"/>
+          <w:sz w:val="19"/>
+          <w:szCs w:val="19"/>
+        </w:rPr>
+        <w:t xml:space="preserve">      "rent": 20,</w:t>
+      </w:r>
+    </w:p>
+    <w:p>
+      <w:pPr>
+        <w:shd w:fill="F3F4F6" w:val="clear"/>
+        <w:spacing w:after="0" w:before="0"/>
+        <w:ind w:left="240" w:right="240"/>
+        <w:jc w:val="left"/>
+      </w:pPr>
+      <w:r>
+        <w:rPr>
+          <w:rFonts w:ascii="Consolas" w:cs="Consolas" w:eastAsia="Consolas" w:hAnsi="Consolas"/>
+          <w:sz w:val="19"/>
+          <w:szCs w:val="19"/>
+        </w:rPr>
+        <w:t xml:space="preserve">      "owner_id": null</w:t>
+      </w:r>
+    </w:p>
+    <w:p>
+      <w:pPr>
+        <w:shd w:fill="F3F4F6" w:val="clear"/>
+        <w:spacing w:after="0" w:before="0"/>
+        <w:ind w:left="240" w:right="240"/>
+        <w:jc w:val="left"/>
+      </w:pPr>
+      <w:r>
+        <w:rPr>
+          <w:rFonts w:ascii="Consolas" w:cs="Consolas" w:eastAsia="Consolas" w:hAnsi="Consolas"/>
+          <w:sz w:val="19"/>
+          <w:szCs w:val="19"/>
+        </w:rPr>
+        <w:t xml:space="preserve">    },</w:t>
+      </w:r>
+    </w:p>
+    <w:p>
+      <w:pPr>
+        <w:shd w:fill="F3F4F6" w:val="clear"/>
+        <w:spacing w:after="0" w:before="0"/>
+        <w:ind w:left="240" w:right="240"/>
+        <w:jc w:val="left"/>
+      </w:pPr>
+      <w:r>
+        <w:rPr>
+          <w:rFonts w:ascii="Consolas" w:cs="Consolas" w:eastAsia="Consolas" w:hAnsi="Consolas"/>
+          <w:sz w:val="19"/>
+          <w:szCs w:val="19"/>
+        </w:rPr>
+        <w:t xml:space="preserve">    {</w:t>
+      </w:r>
+    </w:p>
+    <w:p>
+      <w:pPr>
+        <w:shd w:fill="F3F4F6" w:val="clear"/>
+        <w:spacing w:after="0" w:before="0"/>
+        <w:ind w:left="240" w:right="240"/>
+        <w:jc w:val="left"/>
+      </w:pPr>
+      <w:r>
+        <w:rPr>
+          <w:rFonts w:ascii="Consolas" w:cs="Consolas" w:eastAsia="Consolas" w:hAnsi="Consolas"/>
+          <w:sz w:val="19"/>
+          <w:szCs w:val="19"/>
+        </w:rPr>
+        <w:t xml:space="preserve">      "id": 2,</w:t>
+      </w:r>
+    </w:p>
+    <w:p>
+      <w:pPr>
+        <w:shd w:fill="F3F4F6" w:val="clear"/>
+        <w:spacing w:after="0" w:before="0"/>
+        <w:ind w:left="240" w:right="240"/>
+        <w:jc w:val="left"/>
+      </w:pPr>
+      <w:r>
+        <w:rPr>
+          <w:rFonts w:ascii="Consolas" w:cs="Consolas" w:eastAsia="Consolas" w:hAnsi="Consolas"/>
+          <w:sz w:val="19"/>
+          <w:szCs w:val="19"/>
+        </w:rPr>
+        <w:t xml:space="preserve">      "name": "פסטיבל תרבות",</w:t>
+      </w:r>
+    </w:p>
+    <w:p>
+      <w:pPr>
+        <w:shd w:fill="F3F4F6" w:val="clear"/>
+        <w:spacing w:after="0" w:before="0"/>
+        <w:ind w:left="240" w:right="240"/>
+        <w:jc w:val="left"/>
+      </w:pPr>
+      <w:r>
+        <w:rPr>
+          <w:rFonts w:ascii="Consolas" w:cs="Consolas" w:eastAsia="Consolas" w:hAnsi="Consolas"/>
+          <w:sz w:val="19"/>
+          <w:szCs w:val="19"/>
+        </w:rPr>
+        <w:t xml:space="preserve">      "type": "reward",</w:t>
+      </w:r>
+    </w:p>
+    <w:p>
+      <w:pPr>
+        <w:shd w:fill="F3F4F6" w:val="clear"/>
+        <w:spacing w:after="0" w:before="0"/>
+        <w:ind w:left="240" w:right="240"/>
+        <w:jc w:val="left"/>
+      </w:pPr>
+      <w:r>
+        <w:rPr>
+          <w:rFonts w:ascii="Consolas" w:cs="Consolas" w:eastAsia="Consolas" w:hAnsi="Consolas"/>
+          <w:sz w:val="19"/>
+          <w:szCs w:val="19"/>
+        </w:rPr>
+        <w:t xml:space="preserve">      "amount": 100</w:t>
+      </w:r>
+    </w:p>
+    <w:p>
+      <w:pPr>
+        <w:shd w:fill="F3F4F6" w:val="clear"/>
+        <w:spacing w:after="0" w:before="0"/>
+        <w:ind w:left="240" w:right="240"/>
+        <w:jc w:val="left"/>
+      </w:pPr>
+      <w:r>
+        <w:rPr>
+          <w:rFonts w:ascii="Consolas" w:cs="Consolas" w:eastAsia="Consolas" w:hAnsi="Consolas"/>
+          <w:sz w:val="19"/>
+          <w:szCs w:val="19"/>
+        </w:rPr>
+        <w:t xml:space="preserve">    },</w:t>
+      </w:r>
+    </w:p>
+    <w:p>
+      <w:pPr>
+        <w:shd w:fill="F3F4F6" w:val="clear"/>
+        <w:spacing w:after="0" w:before="0"/>
+        <w:ind w:left="240" w:right="240"/>
+        <w:jc w:val="left"/>
+      </w:pPr>
+      <w:r>
+        <w:rPr>
+          <w:rFonts w:ascii="Consolas" w:cs="Consolas" w:eastAsia="Consolas" w:hAnsi="Consolas"/>
+          <w:sz w:val="19"/>
+          <w:szCs w:val="19"/>
+        </w:rPr>
+        <w:t xml:space="preserve">    {</w:t>
+      </w:r>
+    </w:p>
+    <w:p>
+      <w:pPr>
+        <w:shd w:fill="F3F4F6" w:val="clear"/>
+        <w:spacing w:after="0" w:before="0"/>
+        <w:ind w:left="240" w:right="240"/>
+        <w:jc w:val="left"/>
+      </w:pPr>
+      <w:r>
+        <w:rPr>
+          <w:rFonts w:ascii="Consolas" w:cs="Consolas" w:eastAsia="Consolas" w:hAnsi="Consolas"/>
+          <w:sz w:val="19"/>
+          <w:szCs w:val="19"/>
+        </w:rPr>
+        <w:t xml:space="preserve">      "id": 3,</w:t>
+      </w:r>
+    </w:p>
+    <w:p>
+      <w:pPr>
+        <w:shd w:fill="F3F4F6" w:val="clear"/>
+        <w:spacing w:after="0" w:before="0"/>
+        <w:ind w:left="240" w:right="240"/>
+        <w:jc w:val="left"/>
+      </w:pPr>
+      <w:r>
+        <w:rPr>
+          <w:rFonts w:ascii="Consolas" w:cs="Consolas" w:eastAsia="Consolas" w:hAnsi="Consolas"/>
+          <w:sz w:val="19"/>
+          <w:szCs w:val="19"/>
+        </w:rPr>
+        <w:t xml:space="preserve">      "name": "קהיר",</w:t>
+      </w:r>
+    </w:p>
+    <w:p>
+      <w:pPr>
+        <w:shd w:fill="F3F4F6" w:val="clear"/>
+        <w:spacing w:after="0" w:before="0"/>
+        <w:ind w:left="240" w:right="240"/>
+        <w:jc w:val="left"/>
+      </w:pPr>
+      <w:r>
+        <w:rPr>
+          <w:rFonts w:ascii="Consolas" w:cs="Consolas" w:eastAsia="Consolas" w:hAnsi="Consolas"/>
+          <w:sz w:val="19"/>
+          <w:szCs w:val="19"/>
+        </w:rPr>
+        <w:t xml:space="preserve">      "type": "property",</w:t>
+      </w:r>
+    </w:p>
+    <w:p>
+      <w:pPr>
+        <w:shd w:fill="F3F4F6" w:val="clear"/>
+        <w:spacing w:after="0" w:before="0"/>
+        <w:ind w:left="240" w:right="240"/>
+        <w:jc w:val="left"/>
+      </w:pPr>
+      <w:r>
+        <w:rPr>
+          <w:rFonts w:ascii="Consolas" w:cs="Consolas" w:eastAsia="Consolas" w:hAnsi="Consolas"/>
+          <w:sz w:val="19"/>
+          <w:szCs w:val="19"/>
+        </w:rPr>
+        <w:t xml:space="preserve">      "price": 120,</w:t>
+      </w:r>
+    </w:p>
+    <w:p>
+      <w:pPr>
+        <w:shd w:fill="F3F4F6" w:val="clear"/>
+        <w:spacing w:after="0" w:before="0"/>
+        <w:ind w:left="240" w:right="240"/>
+        <w:jc w:val="left"/>
+      </w:pPr>
+      <w:r>
+        <w:rPr>
+          <w:rFonts w:ascii="Consolas" w:cs="Consolas" w:eastAsia="Consolas" w:hAnsi="Consolas"/>
+          <w:sz w:val="19"/>
+          <w:szCs w:val="19"/>
+        </w:rPr>
+        <w:t xml:space="preserve">      "rent": 24,</w:t>
+      </w:r>
+    </w:p>
+    <w:p>
+      <w:pPr>
+        <w:shd w:fill="F3F4F6" w:val="clear"/>
+        <w:spacing w:after="0" w:before="0"/>
+        <w:ind w:left="240" w:right="240"/>
+        <w:jc w:val="left"/>
+      </w:pPr>
+      <w:r>
+        <w:rPr>
+          <w:rFonts w:ascii="Consolas" w:cs="Consolas" w:eastAsia="Consolas" w:hAnsi="Consolas"/>
+          <w:sz w:val="19"/>
+          <w:szCs w:val="19"/>
+        </w:rPr>
+        <w:t xml:space="preserve">      "owner_id": null</w:t>
+      </w:r>
+    </w:p>
+    <w:p>
+      <w:pPr>
+        <w:shd w:fill="F3F4F6" w:val="clear"/>
+        <w:spacing w:after="0" w:before="0"/>
+        <w:ind w:left="240" w:right="240"/>
+        <w:jc w:val="left"/>
+      </w:pPr>
+      <w:r>
+        <w:rPr>
+          <w:rFonts w:ascii="Consolas" w:cs="Consolas" w:eastAsia="Consolas" w:hAnsi="Consolas"/>
+          <w:sz w:val="19"/>
+          <w:szCs w:val="19"/>
+        </w:rPr>
+        <w:t xml:space="preserve">    },</w:t>
+      </w:r>
+    </w:p>
+    <w:p>
+      <w:pPr>
+        <w:shd w:fill="F3F4F6" w:val="clear"/>
+        <w:spacing w:after="0" w:before="0"/>
+        <w:ind w:left="240" w:right="240"/>
+        <w:jc w:val="left"/>
+      </w:pPr>
+      <w:r>
+        <w:rPr>
+          <w:rFonts w:ascii="Consolas" w:cs="Consolas" w:eastAsia="Consolas" w:hAnsi="Consolas"/>
+          <w:sz w:val="19"/>
+          <w:szCs w:val="19"/>
+        </w:rPr>
+        <w:t xml:space="preserve">    {</w:t>
+      </w:r>
+    </w:p>
+    <w:p>
+      <w:pPr>
+        <w:shd w:fill="F3F4F6" w:val="clear"/>
+        <w:spacing w:after="0" w:before="0"/>
+        <w:ind w:left="240" w:right="240"/>
+        <w:jc w:val="left"/>
+      </w:pPr>
+      <w:r>
+        <w:rPr>
+          <w:rFonts w:ascii="Consolas" w:cs="Consolas" w:eastAsia="Consolas" w:hAnsi="Consolas"/>
+          <w:sz w:val="19"/>
+          <w:szCs w:val="19"/>
+        </w:rPr>
+        <w:t xml:space="preserve">      "id": 4,</w:t>
+      </w:r>
+    </w:p>
+    <w:p>
+      <w:pPr>
+        <w:shd w:fill="F3F4F6" w:val="clear"/>
+        <w:spacing w:after="0" w:before="0"/>
+        <w:ind w:left="240" w:right="240"/>
+        <w:jc w:val="left"/>
+      </w:pPr>
+      <w:r>
+        <w:rPr>
+          <w:rFonts w:ascii="Consolas" w:cs="Consolas" w:eastAsia="Consolas" w:hAnsi="Consolas"/>
+          <w:sz w:val="19"/>
+          <w:szCs w:val="19"/>
+        </w:rPr>
+        <w:t xml:space="preserve">      "name": "מכס",</w:t>
+      </w:r>
+    </w:p>
+    <w:p>
+      <w:pPr>
+        <w:shd w:fill="F3F4F6" w:val="clear"/>
+        <w:spacing w:after="0" w:before="0"/>
+        <w:ind w:left="240" w:right="240"/>
+        <w:jc w:val="left"/>
+      </w:pPr>
+      <w:r>
+        <w:rPr>
+          <w:rFonts w:ascii="Consolas" w:cs="Consolas" w:eastAsia="Consolas" w:hAnsi="Consolas"/>
+          <w:sz w:val="19"/>
+          <w:szCs w:val="19"/>
+        </w:rPr>
+        <w:t xml:space="preserve">      "type": "penalty",</w:t>
+      </w:r>
+    </w:p>
+    <w:p>
+      <w:pPr>
+        <w:shd w:fill="F3F4F6" w:val="clear"/>
+        <w:spacing w:after="0" w:before="0"/>
+        <w:ind w:left="240" w:right="240"/>
+        <w:jc w:val="left"/>
+      </w:pPr>
+      <w:r>
+        <w:rPr>
+          <w:rFonts w:ascii="Consolas" w:cs="Consolas" w:eastAsia="Consolas" w:hAnsi="Consolas"/>
+          <w:sz w:val="19"/>
+          <w:szCs w:val="19"/>
+        </w:rPr>
+        <w:t xml:space="preserve">      "amount": 350</w:t>
+      </w:r>
+    </w:p>
+    <w:p>
+      <w:pPr>
+        <w:shd w:fill="F3F4F6" w:val="clear"/>
+        <w:spacing w:after="0" w:before="0"/>
+        <w:ind w:left="240" w:right="240"/>
+        <w:jc w:val="left"/>
+      </w:pPr>
+      <w:r>
+        <w:rPr>
+          <w:rFonts w:ascii="Consolas" w:cs="Consolas" w:eastAsia="Consolas" w:hAnsi="Consolas"/>
+          <w:sz w:val="19"/>
+          <w:szCs w:val="19"/>
+        </w:rPr>
+        <w:t xml:space="preserve">    },</w:t>
+      </w:r>
+    </w:p>
+    <w:p>
+      <w:pPr>
+        <w:shd w:fill="F3F4F6" w:val="clear"/>
+        <w:spacing w:after="0" w:before="0"/>
+        <w:ind w:left="240" w:right="240"/>
+        <w:jc w:val="left"/>
+      </w:pPr>
+      <w:r>
+        <w:rPr>
+          <w:rFonts w:ascii="Consolas" w:cs="Consolas" w:eastAsia="Consolas" w:hAnsi="Consolas"/>
+          <w:sz w:val="19"/>
+          <w:szCs w:val="19"/>
+        </w:rPr>
+        <w:t xml:space="preserve">    {</w:t>
+      </w:r>
+    </w:p>
+    <w:p>
+      <w:pPr>
+        <w:shd w:fill="F3F4F6" w:val="clear"/>
+        <w:spacing w:after="0" w:before="0"/>
+        <w:ind w:left="240" w:right="240"/>
+        <w:jc w:val="left"/>
+      </w:pPr>
+      <w:r>
+        <w:rPr>
+          <w:rFonts w:ascii="Consolas" w:cs="Consolas" w:eastAsia="Consolas" w:hAnsi="Consolas"/>
+          <w:sz w:val="19"/>
+          <w:szCs w:val="19"/>
+        </w:rPr>
+        <w:t xml:space="preserve">      "id": 5,</w:t>
+      </w:r>
+    </w:p>
+    <w:p>
+      <w:pPr>
+        <w:shd w:fill="F3F4F6" w:val="clear"/>
+        <w:spacing w:after="0" w:before="0"/>
+        <w:ind w:left="240" w:right="240"/>
+        <w:jc w:val="left"/>
+      </w:pPr>
+      <w:r>
+        <w:rPr>
+          <w:rFonts w:ascii="Consolas" w:cs="Consolas" w:eastAsia="Consolas" w:hAnsi="Consolas"/>
+          <w:sz w:val="19"/>
+          <w:szCs w:val="19"/>
+        </w:rPr>
+        <w:t xml:space="preserve">      "name": "איחוד האמירויות",</w:t>
+      </w:r>
+    </w:p>
+    <w:p>
+      <w:pPr>
+        <w:shd w:fill="F3F4F6" w:val="clear"/>
+        <w:spacing w:after="0" w:before="0"/>
+        <w:ind w:left="240" w:right="240"/>
+        <w:jc w:val="left"/>
+      </w:pPr>
+      <w:r>
+        <w:rPr>
+          <w:rFonts w:ascii="Consolas" w:cs="Consolas" w:eastAsia="Consolas" w:hAnsi="Consolas"/>
+          <w:sz w:val="19"/>
+          <w:szCs w:val="19"/>
+        </w:rPr>
+        <w:t xml:space="preserve">      "type": "property",</w:t>
+      </w:r>
+    </w:p>
+    <w:p>
+      <w:pPr>
+        <w:shd w:fill="F3F4F6" w:val="clear"/>
+        <w:spacing w:after="0" w:before="0"/>
+        <w:ind w:left="240" w:right="240"/>
+        <w:jc w:val="left"/>
+      </w:pPr>
+      <w:r>
+        <w:rPr>
+          <w:rFonts w:ascii="Consolas" w:cs="Consolas" w:eastAsia="Consolas" w:hAnsi="Consolas"/>
+          <w:sz w:val="19"/>
+          <w:szCs w:val="19"/>
+        </w:rPr>
+        <w:t xml:space="preserve">      "price": 140,</w:t>
+      </w:r>
+    </w:p>
+    <w:p>
+      <w:pPr>
+        <w:shd w:fill="F3F4F6" w:val="clear"/>
+        <w:spacing w:after="0" w:before="0"/>
+        <w:ind w:left="240" w:right="240"/>
+        <w:jc w:val="left"/>
+      </w:pPr>
+      <w:r>
+        <w:rPr>
+          <w:rFonts w:ascii="Consolas" w:cs="Consolas" w:eastAsia="Consolas" w:hAnsi="Consolas"/>
+          <w:sz w:val="19"/>
+          <w:szCs w:val="19"/>
+        </w:rPr>
+        <w:t xml:space="preserve">      "rent": 28,</w:t>
+      </w:r>
+    </w:p>
+    <w:p>
+      <w:pPr>
+        <w:shd w:fill="F3F4F6" w:val="clear"/>
+        <w:spacing w:after="0" w:before="0"/>
+        <w:ind w:left="240" w:right="240"/>
+        <w:jc w:val="left"/>
+      </w:pPr>
+      <w:r>
+        <w:rPr>
+          <w:rFonts w:ascii="Consolas" w:cs="Consolas" w:eastAsia="Consolas" w:hAnsi="Consolas"/>
+          <w:sz w:val="19"/>
+          <w:szCs w:val="19"/>
+        </w:rPr>
+        <w:t xml:space="preserve">      "owner_id": null</w:t>
+      </w:r>
+    </w:p>
+    <w:p>
+      <w:pPr>
+        <w:shd w:fill="F3F4F6" w:val="clear"/>
+        <w:spacing w:after="0" w:before="0"/>
+        <w:ind w:left="240" w:right="240"/>
+        <w:jc w:val="left"/>
+      </w:pPr>
+      <w:r>
+        <w:rPr>
+          <w:rFonts w:ascii="Consolas" w:cs="Consolas" w:eastAsia="Consolas" w:hAnsi="Consolas"/>
+          <w:sz w:val="19"/>
+          <w:szCs w:val="19"/>
+        </w:rPr>
+        <w:t xml:space="preserve">    },</w:t>
+      </w:r>
+    </w:p>
+    <w:p>
+      <w:pPr>
+        <w:shd w:fill="F3F4F6" w:val="clear"/>
+        <w:spacing w:after="0" w:before="0"/>
+        <w:ind w:left="240" w:right="240"/>
+        <w:jc w:val="left"/>
+      </w:pPr>
+      <w:r>
+        <w:rPr>
+          <w:rFonts w:ascii="Consolas" w:cs="Consolas" w:eastAsia="Consolas" w:hAnsi="Consolas"/>
+          <w:sz w:val="19"/>
+          <w:szCs w:val="19"/>
+        </w:rPr>
+        <w:t xml:space="preserve">    {</w:t>
+      </w:r>
+    </w:p>
+    <w:p>
+      <w:pPr>
+        <w:shd w:fill="F3F4F6" w:val="clear"/>
+        <w:spacing w:after="0" w:before="0"/>
+        <w:ind w:left="240" w:right="240"/>
+        <w:jc w:val="left"/>
+      </w:pPr>
+      <w:r>
+        <w:rPr>
+          <w:rFonts w:ascii="Consolas" w:cs="Consolas" w:eastAsia="Consolas" w:hAnsi="Consolas"/>
+          <w:sz w:val="19"/>
+          <w:szCs w:val="19"/>
+        </w:rPr>
+        <w:t xml:space="preserve">      "id": 6,</w:t>
+      </w:r>
+    </w:p>
+    <w:p>
+      <w:pPr>
+        <w:shd w:fill="F3F4F6" w:val="clear"/>
+        <w:spacing w:after="0" w:before="0"/>
+        <w:ind w:left="240" w:right="240"/>
+        <w:jc w:val="left"/>
+      </w:pPr>
+      <w:r>
+        <w:rPr>
+          <w:rFonts w:ascii="Consolas" w:cs="Consolas" w:eastAsia="Consolas" w:hAnsi="Consolas"/>
+          <w:sz w:val="19"/>
+          <w:szCs w:val="19"/>
+        </w:rPr>
+        <w:t xml:space="preserve">      "name": "הפתעה במדבר",</w:t>
+      </w:r>
+    </w:p>
+    <w:p>
+      <w:pPr>
+        <w:shd w:fill="F3F4F6" w:val="clear"/>
+        <w:spacing w:after="0" w:before="0"/>
+        <w:ind w:left="240" w:right="240"/>
+        <w:jc w:val="left"/>
+      </w:pPr>
+      <w:r>
+        <w:rPr>
+          <w:rFonts w:ascii="Consolas" w:cs="Consolas" w:eastAsia="Consolas" w:hAnsi="Consolas"/>
+          <w:sz w:val="19"/>
+          <w:szCs w:val="19"/>
+        </w:rPr>
+        <w:t xml:space="preserve">      "type": "surprise"</w:t>
+      </w:r>
+    </w:p>
+    <w:p>
+      <w:pPr>
+        <w:shd w:fill="F3F4F6" w:val="clear"/>
+        <w:spacing w:after="0" w:before="0"/>
+        <w:ind w:left="240" w:right="240"/>
+        <w:jc w:val="left"/>
+      </w:pPr>
+      <w:r>
+        <w:rPr>
+          <w:rFonts w:ascii="Consolas" w:cs="Consolas" w:eastAsia="Consolas" w:hAnsi="Consolas"/>
+          <w:sz w:val="19"/>
+          <w:szCs w:val="19"/>
+        </w:rPr>
+        <w:t xml:space="preserve">    },</w:t>
+      </w:r>
+    </w:p>
+    <w:p>
+      <w:pPr>
+        <w:shd w:fill="F3F4F6" w:val="clear"/>
+        <w:spacing w:after="0" w:before="0"/>
+        <w:ind w:left="240" w:right="240"/>
+        <w:jc w:val="left"/>
+      </w:pPr>
+      <w:r>
+        <w:rPr>
+          <w:rFonts w:ascii="Consolas" w:cs="Consolas" w:eastAsia="Consolas" w:hAnsi="Consolas"/>
+          <w:sz w:val="19"/>
+          <w:szCs w:val="19"/>
+        </w:rPr>
+        <w:t xml:space="preserve">    {</w:t>
+      </w:r>
+    </w:p>
+    <w:p>
+      <w:pPr>
+        <w:shd w:fill="F3F4F6" w:val="clear"/>
+        <w:spacing w:after="0" w:before="0"/>
+        <w:ind w:left="240" w:right="240"/>
+        <w:jc w:val="left"/>
+      </w:pPr>
+      <w:r>
+        <w:rPr>
+          <w:rFonts w:ascii="Consolas" w:cs="Consolas" w:eastAsia="Consolas" w:hAnsi="Consolas"/>
+          <w:sz w:val="19"/>
+          <w:szCs w:val="19"/>
+        </w:rPr>
+        <w:t xml:space="preserve">      "id": 7,</w:t>
+      </w:r>
+    </w:p>
+    <w:p>
+      <w:pPr>
+        <w:shd w:fill="F3F4F6" w:val="clear"/>
+        <w:spacing w:after="0" w:before="0"/>
+        <w:ind w:left="240" w:right="240"/>
+        <w:jc w:val="left"/>
+      </w:pPr>
+      <w:r>
+        <w:rPr>
+          <w:rFonts w:ascii="Consolas" w:cs="Consolas" w:eastAsia="Consolas" w:hAnsi="Consolas"/>
+          <w:sz w:val="19"/>
+          <w:szCs w:val="19"/>
+        </w:rPr>
+        <w:t xml:space="preserve">      "name": "דובאי",</w:t>
+      </w:r>
+    </w:p>
+    <w:p>
+      <w:pPr>
+        <w:shd w:fill="F3F4F6" w:val="clear"/>
+        <w:spacing w:after="0" w:before="0"/>
+        <w:ind w:left="240" w:right="240"/>
+        <w:jc w:val="left"/>
+      </w:pPr>
+      <w:r>
+        <w:rPr>
+          <w:rFonts w:ascii="Consolas" w:cs="Consolas" w:eastAsia="Consolas" w:hAnsi="Consolas"/>
+          <w:sz w:val="19"/>
+          <w:szCs w:val="19"/>
+        </w:rPr>
+        <w:t xml:space="preserve">      "type": "property",</w:t>
+      </w:r>
+    </w:p>
+    <w:p>
+      <w:pPr>
+        <w:shd w:fill="F3F4F6" w:val="clear"/>
+        <w:spacing w:after="0" w:before="0"/>
+        <w:ind w:left="240" w:right="240"/>
+        <w:jc w:val="left"/>
+      </w:pPr>
+      <w:r>
+        <w:rPr>
+          <w:rFonts w:ascii="Consolas" w:cs="Consolas" w:eastAsia="Consolas" w:hAnsi="Consolas"/>
+          <w:sz w:val="19"/>
+          <w:szCs w:val="19"/>
+        </w:rPr>
+        <w:t xml:space="preserve">      "price": 160,</w:t>
+      </w:r>
+    </w:p>
+    <w:p>
+      <w:pPr>
+        <w:shd w:fill="F3F4F6" w:val="clear"/>
+        <w:spacing w:after="0" w:before="0"/>
+        <w:ind w:left="240" w:right="240"/>
+        <w:jc w:val="left"/>
+      </w:pPr>
+      <w:r>
+        <w:rPr>
+          <w:rFonts w:ascii="Consolas" w:cs="Consolas" w:eastAsia="Consolas" w:hAnsi="Consolas"/>
+          <w:sz w:val="19"/>
+          <w:szCs w:val="19"/>
+        </w:rPr>
+        <w:t xml:space="preserve">      "rent": 32,</w:t>
+      </w:r>
+    </w:p>
+    <w:p>
+      <w:pPr>
+        <w:shd w:fill="F3F4F6" w:val="clear"/>
+        <w:spacing w:after="0" w:before="0"/>
+        <w:ind w:left="240" w:right="240"/>
+        <w:jc w:val="left"/>
+      </w:pPr>
+      <w:r>
+        <w:rPr>
+          <w:rFonts w:ascii="Consolas" w:cs="Consolas" w:eastAsia="Consolas" w:hAnsi="Consolas"/>
+          <w:sz w:val="19"/>
+          <w:szCs w:val="19"/>
+        </w:rPr>
+        <w:t xml:space="preserve">      "owner_id": null</w:t>
+      </w:r>
+    </w:p>
+    <w:p>
+      <w:pPr>
+        <w:shd w:fill="F3F4F6" w:val="clear"/>
+        <w:spacing w:after="0" w:before="0"/>
+        <w:ind w:left="240" w:right="240"/>
+        <w:jc w:val="left"/>
+      </w:pPr>
+      <w:r>
+        <w:rPr>
+          <w:rFonts w:ascii="Consolas" w:cs="Consolas" w:eastAsia="Consolas" w:hAnsi="Consolas"/>
+          <w:sz w:val="19"/>
+          <w:szCs w:val="19"/>
+        </w:rPr>
+        <w:t xml:space="preserve">    },</w:t>
+      </w:r>
+    </w:p>
+    <w:p>
+      <w:pPr>
+        <w:shd w:fill="F3F4F6" w:val="clear"/>
+        <w:spacing w:after="0" w:before="0"/>
+        <w:ind w:left="240" w:right="240"/>
+        <w:jc w:val="left"/>
+      </w:pPr>
+      <w:r>
+        <w:rPr>
+          <w:rFonts w:ascii="Consolas" w:cs="Consolas" w:eastAsia="Consolas" w:hAnsi="Consolas"/>
+          <w:sz w:val="19"/>
+          <w:szCs w:val="19"/>
+        </w:rPr>
+        <w:t xml:space="preserve">    {</w:t>
+      </w:r>
+    </w:p>
+    <w:p>
+      <w:pPr>
+        <w:shd w:fill="F3F4F6" w:val="clear"/>
+        <w:spacing w:after="0" w:before="0"/>
+        <w:ind w:left="240" w:right="240"/>
+        <w:jc w:val="left"/>
+      </w:pPr>
+      <w:r>
+        <w:rPr>
+          <w:rFonts w:ascii="Consolas" w:cs="Consolas" w:eastAsia="Consolas" w:hAnsi="Consolas"/>
+          <w:sz w:val="19"/>
+          <w:szCs w:val="19"/>
+        </w:rPr>
+        <w:t xml:space="preserve">      "id": 8,</w:t>
+      </w:r>
+    </w:p>
+    <w:p>
+      <w:pPr>
+        <w:shd w:fill="F3F4F6" w:val="clear"/>
+        <w:spacing w:after="0" w:before="0"/>
+        <w:ind w:left="240" w:right="240"/>
+        <w:jc w:val="left"/>
+      </w:pPr>
+      <w:r>
+        <w:rPr>
+          <w:rFonts w:ascii="Consolas" w:cs="Consolas" w:eastAsia="Consolas" w:hAnsi="Consolas"/>
+          <w:sz w:val="19"/>
+          <w:szCs w:val="19"/>
+        </w:rPr>
+        <w:t xml:space="preserve">      "name": "עסקת נפט",</w:t>
+      </w:r>
+    </w:p>
+    <w:p>
+      <w:pPr>
+        <w:shd w:fill="F3F4F6" w:val="clear"/>
+        <w:spacing w:after="0" w:before="0"/>
+        <w:ind w:left="240" w:right="240"/>
+        <w:jc w:val="left"/>
+      </w:pPr>
+      <w:r>
+        <w:rPr>
+          <w:rFonts w:ascii="Consolas" w:cs="Consolas" w:eastAsia="Consolas" w:hAnsi="Consolas"/>
+          <w:sz w:val="19"/>
+          <w:szCs w:val="19"/>
+        </w:rPr>
+        <w:t xml:space="preserve">      "type": "reward",</w:t>
+      </w:r>
+    </w:p>
+    <w:p>
+      <w:pPr>
+        <w:shd w:fill="F3F4F6" w:val="clear"/>
+        <w:spacing w:after="0" w:before="0"/>
+        <w:ind w:left="240" w:right="240"/>
+        <w:jc w:val="left"/>
+      </w:pPr>
+      <w:r>
+        <w:rPr>
+          <w:rFonts w:ascii="Consolas" w:cs="Consolas" w:eastAsia="Consolas" w:hAnsi="Consolas"/>
+          <w:sz w:val="19"/>
+          <w:szCs w:val="19"/>
+        </w:rPr>
+        <w:t xml:space="preserve">      "amount": 150</w:t>
+      </w:r>
+    </w:p>
+    <w:p>
+      <w:pPr>
+        <w:shd w:fill="F3F4F6" w:val="clear"/>
+        <w:spacing w:after="0" w:before="0"/>
+        <w:ind w:left="240" w:right="240"/>
+        <w:jc w:val="left"/>
+      </w:pPr>
+      <w:r>
+        <w:rPr>
+          <w:rFonts w:ascii="Consolas" w:cs="Consolas" w:eastAsia="Consolas" w:hAnsi="Consolas"/>
+          <w:sz w:val="19"/>
+          <w:szCs w:val="19"/>
+        </w:rPr>
+        <w:t xml:space="preserve">    },</w:t>
+      </w:r>
+    </w:p>
+    <w:p>
+      <w:pPr>
+        <w:shd w:fill="F3F4F6" w:val="clear"/>
+        <w:spacing w:after="0" w:before="0"/>
+        <w:ind w:left="240" w:right="240"/>
+        <w:jc w:val="left"/>
+      </w:pPr>
+      <w:r>
+        <w:rPr>
+          <w:rFonts w:ascii="Consolas" w:cs="Consolas" w:eastAsia="Consolas" w:hAnsi="Consolas"/>
+          <w:sz w:val="19"/>
+          <w:szCs w:val="19"/>
+        </w:rPr>
+        <w:t xml:space="preserve">    {</w:t>
+      </w:r>
+    </w:p>
+    <w:p>
+      <w:pPr>
+        <w:shd w:fill="F3F4F6" w:val="clear"/>
+        <w:spacing w:after="0" w:before="0"/>
+        <w:ind w:left="240" w:right="240"/>
+        <w:jc w:val="left"/>
+      </w:pPr>
+      <w:r>
+        <w:rPr>
+          <w:rFonts w:ascii="Consolas" w:cs="Consolas" w:eastAsia="Consolas" w:hAnsi="Consolas"/>
+          <w:sz w:val="19"/>
+          <w:szCs w:val="19"/>
+        </w:rPr>
+        <w:t xml:space="preserve">      "id": 9,</w:t>
+      </w:r>
+    </w:p>
+    <w:p>
+      <w:pPr>
+        <w:shd w:fill="F3F4F6" w:val="clear"/>
+        <w:spacing w:after="0" w:before="0"/>
+        <w:ind w:left="240" w:right="240"/>
+        <w:jc w:val="left"/>
+      </w:pPr>
+      <w:r>
+        <w:rPr>
+          <w:rFonts w:ascii="Consolas" w:cs="Consolas" w:eastAsia="Consolas" w:hAnsi="Consolas"/>
+          <w:sz w:val="19"/>
+          <w:szCs w:val="19"/>
+        </w:rPr>
+        <w:t xml:space="preserve">      "name": "מרוקו",</w:t>
+      </w:r>
+    </w:p>
+    <w:p>
+      <w:pPr>
+        <w:shd w:fill="F3F4F6" w:val="clear"/>
+        <w:spacing w:after="0" w:before="0"/>
+        <w:ind w:left="240" w:right="240"/>
+        <w:jc w:val="left"/>
+      </w:pPr>
+      <w:r>
+        <w:rPr>
+          <w:rFonts w:ascii="Consolas" w:cs="Consolas" w:eastAsia="Consolas" w:hAnsi="Consolas"/>
+          <w:sz w:val="19"/>
+          <w:szCs w:val="19"/>
+        </w:rPr>
+        <w:t xml:space="preserve">      "type": "property",</w:t>
+      </w:r>
+    </w:p>
+    <w:p>
+      <w:pPr>
+        <w:shd w:fill="F3F4F6" w:val="clear"/>
+        <w:spacing w:after="0" w:before="0"/>
+        <w:ind w:left="240" w:right="240"/>
+        <w:jc w:val="left"/>
+      </w:pPr>
+      <w:r>
+        <w:rPr>
+          <w:rFonts w:ascii="Consolas" w:cs="Consolas" w:eastAsia="Consolas" w:hAnsi="Consolas"/>
+          <w:sz w:val="19"/>
+          <w:szCs w:val="19"/>
+        </w:rPr>
+        <w:t xml:space="preserve">      "price": 180,</w:t>
+      </w:r>
+    </w:p>
+    <w:p>
+      <w:pPr>
+        <w:shd w:fill="F3F4F6" w:val="clear"/>
+        <w:spacing w:after="0" w:before="0"/>
+        <w:ind w:left="240" w:right="240"/>
+        <w:jc w:val="left"/>
+      </w:pPr>
+      <w:r>
+        <w:rPr>
+          <w:rFonts w:ascii="Consolas" w:cs="Consolas" w:eastAsia="Consolas" w:hAnsi="Consolas"/>
+          <w:sz w:val="19"/>
+          <w:szCs w:val="19"/>
+        </w:rPr>
+        <w:t xml:space="preserve">      "rent": 36,</w:t>
+      </w:r>
+    </w:p>
+    <w:p>
+      <w:pPr>
+        <w:shd w:fill="F3F4F6" w:val="clear"/>
+        <w:spacing w:after="0" w:before="0"/>
+        <w:ind w:left="240" w:right="240"/>
+        <w:jc w:val="left"/>
+      </w:pPr>
+      <w:r>
+        <w:rPr>
+          <w:rFonts w:ascii="Consolas" w:cs="Consolas" w:eastAsia="Consolas" w:hAnsi="Consolas"/>
+          <w:sz w:val="19"/>
+          <w:szCs w:val="19"/>
+        </w:rPr>
+        <w:t xml:space="preserve">      "owner_id": null</w:t>
+      </w:r>
+    </w:p>
+    <w:p>
+      <w:pPr>
+        <w:shd w:fill="F3F4F6" w:val="clear"/>
+        <w:spacing w:after="0" w:before="0"/>
+        <w:ind w:left="240" w:right="240"/>
+        <w:jc w:val="left"/>
+      </w:pPr>
+      <w:r>
+        <w:rPr>
+          <w:rFonts w:ascii="Consolas" w:cs="Consolas" w:eastAsia="Consolas" w:hAnsi="Consolas"/>
+          <w:sz w:val="19"/>
+          <w:szCs w:val="19"/>
+        </w:rPr>
+        <w:t xml:space="preserve">    },</w:t>
+      </w:r>
+    </w:p>
+    <w:p>
+      <w:pPr>
+        <w:shd w:fill="F3F4F6" w:val="clear"/>
+        <w:spacing w:after="0" w:before="0"/>
+        <w:ind w:left="240" w:right="240"/>
+        <w:jc w:val="left"/>
+      </w:pPr>
+      <w:r>
+        <w:rPr>
+          <w:rFonts w:ascii="Consolas" w:cs="Consolas" w:eastAsia="Consolas" w:hAnsi="Consolas"/>
+          <w:sz w:val="19"/>
+          <w:szCs w:val="19"/>
+        </w:rPr>
+        <w:t xml:space="preserve">    {</w:t>
+      </w:r>
+    </w:p>
+    <w:p>
+      <w:pPr>
+        <w:shd w:fill="F3F4F6" w:val="clear"/>
+        <w:spacing w:after="0" w:before="0"/>
+        <w:ind w:left="240" w:right="240"/>
+        <w:jc w:val="left"/>
+      </w:pPr>
+      <w:r>
+        <w:rPr>
+          <w:rFonts w:ascii="Consolas" w:cs="Consolas" w:eastAsia="Consolas" w:hAnsi="Consolas"/>
+          <w:sz w:val="19"/>
+          <w:szCs w:val="19"/>
+        </w:rPr>
+        <w:t xml:space="preserve">      "id": 10,</w:t>
+      </w:r>
+    </w:p>
+    <w:p>
+      <w:pPr>
+        <w:shd w:fill="F3F4F6" w:val="clear"/>
+        <w:spacing w:after="0" w:before="0"/>
+        <w:ind w:left="240" w:right="240"/>
+        <w:jc w:val="left"/>
+      </w:pPr>
+      <w:r>
+        <w:rPr>
+          <w:rFonts w:ascii="Consolas" w:cs="Consolas" w:eastAsia="Consolas" w:hAnsi="Consolas"/>
+          <w:sz w:val="19"/>
+          <w:szCs w:val="19"/>
+        </w:rPr>
+        <w:t xml:space="preserve">      "name": "מס נמל",</w:t>
+      </w:r>
+    </w:p>
+    <w:p>
+      <w:pPr>
+        <w:shd w:fill="F3F4F6" w:val="clear"/>
+        <w:spacing w:after="0" w:before="0"/>
+        <w:ind w:left="240" w:right="240"/>
+        <w:jc w:val="left"/>
+      </w:pPr>
+      <w:r>
+        <w:rPr>
+          <w:rFonts w:ascii="Consolas" w:cs="Consolas" w:eastAsia="Consolas" w:hAnsi="Consolas"/>
+          <w:sz w:val="19"/>
+          <w:szCs w:val="19"/>
+        </w:rPr>
+        <w:t xml:space="preserve">      "type": "penalty",</w:t>
+      </w:r>
+    </w:p>
+    <w:p>
+      <w:pPr>
+        <w:shd w:fill="F3F4F6" w:val="clear"/>
+        <w:spacing w:after="0" w:before="0"/>
+        <w:ind w:left="240" w:right="240"/>
+        <w:jc w:val="left"/>
+      </w:pPr>
+      <w:r>
+        <w:rPr>
+          <w:rFonts w:ascii="Consolas" w:cs="Consolas" w:eastAsia="Consolas" w:hAnsi="Consolas"/>
+          <w:sz w:val="19"/>
+          <w:szCs w:val="19"/>
+        </w:rPr>
+        <w:t xml:space="preserve">      "amount": 450</w:t>
+      </w:r>
+    </w:p>
+    <w:p>
+      <w:pPr>
+        <w:shd w:fill="F3F4F6" w:val="clear"/>
+        <w:spacing w:after="0" w:before="0"/>
+        <w:ind w:left="240" w:right="240"/>
+        <w:jc w:val="left"/>
+      </w:pPr>
+      <w:r>
+        <w:rPr>
+          <w:rFonts w:ascii="Consolas" w:cs="Consolas" w:eastAsia="Consolas" w:hAnsi="Consolas"/>
+          <w:sz w:val="19"/>
+          <w:szCs w:val="19"/>
+        </w:rPr>
+        <w:t xml:space="preserve">    },</w:t>
+      </w:r>
+    </w:p>
+    <w:p>
+      <w:pPr>
+        <w:shd w:fill="F3F4F6" w:val="clear"/>
+        <w:spacing w:after="0" w:before="0"/>
+        <w:ind w:left="240" w:right="240"/>
+        <w:jc w:val="left"/>
+      </w:pPr>
+      <w:r>
+        <w:rPr>
+          <w:rFonts w:ascii="Consolas" w:cs="Consolas" w:eastAsia="Consolas" w:hAnsi="Consolas"/>
+          <w:sz w:val="19"/>
+          <w:szCs w:val="19"/>
+        </w:rPr>
+        <w:t xml:space="preserve">    {</w:t>
+      </w:r>
+    </w:p>
+    <w:p>
+      <w:pPr>
+        <w:shd w:fill="F3F4F6" w:val="clear"/>
+        <w:spacing w:after="0" w:before="0"/>
+        <w:ind w:left="240" w:right="240"/>
+        <w:jc w:val="left"/>
+      </w:pPr>
+      <w:r>
+        <w:rPr>
+          <w:rFonts w:ascii="Consolas" w:cs="Consolas" w:eastAsia="Consolas" w:hAnsi="Consolas"/>
+          <w:sz w:val="19"/>
+          <w:szCs w:val="19"/>
+        </w:rPr>
+        <w:t xml:space="preserve">      "id": 11,</w:t>
+      </w:r>
+    </w:p>
+    <w:p>
+      <w:pPr>
+        <w:shd w:fill="F3F4F6" w:val="clear"/>
+        <w:spacing w:after="0" w:before="0"/>
+        <w:ind w:left="240" w:right="240"/>
+        <w:jc w:val="left"/>
+      </w:pPr>
+      <w:r>
+        <w:rPr>
+          <w:rFonts w:ascii="Consolas" w:cs="Consolas" w:eastAsia="Consolas" w:hAnsi="Consolas"/>
+          <w:sz w:val="19"/>
+          <w:szCs w:val="19"/>
+        </w:rPr>
+        <w:t xml:space="preserve">      "name": "ביירות",</w:t>
+      </w:r>
+    </w:p>
+    <w:p>
+      <w:pPr>
+        <w:shd w:fill="F3F4F6" w:val="clear"/>
+        <w:spacing w:after="0" w:before="0"/>
+        <w:ind w:left="240" w:right="240"/>
+        <w:jc w:val="left"/>
+      </w:pPr>
+      <w:r>
+        <w:rPr>
+          <w:rFonts w:ascii="Consolas" w:cs="Consolas" w:eastAsia="Consolas" w:hAnsi="Consolas"/>
+          <w:sz w:val="19"/>
+          <w:szCs w:val="19"/>
+        </w:rPr>
+        <w:t xml:space="preserve">      "type": "property",</w:t>
+      </w:r>
+    </w:p>
+    <w:p>
+      <w:pPr>
+        <w:shd w:fill="F3F4F6" w:val="clear"/>
+        <w:spacing w:after="0" w:before="0"/>
+        <w:ind w:left="240" w:right="240"/>
+        <w:jc w:val="left"/>
+      </w:pPr>
+      <w:r>
+        <w:rPr>
+          <w:rFonts w:ascii="Consolas" w:cs="Consolas" w:eastAsia="Consolas" w:hAnsi="Consolas"/>
+          <w:sz w:val="19"/>
+          <w:szCs w:val="19"/>
+        </w:rPr>
+        <w:t xml:space="preserve">      "price": 200,</w:t>
+      </w:r>
+    </w:p>
+    <w:p>
+      <w:pPr>
+        <w:shd w:fill="F3F4F6" w:val="clear"/>
+        <w:spacing w:after="0" w:before="0"/>
+        <w:ind w:left="240" w:right="240"/>
+        <w:jc w:val="left"/>
+      </w:pPr>
+      <w:r>
+        <w:rPr>
+          <w:rFonts w:ascii="Consolas" w:cs="Consolas" w:eastAsia="Consolas" w:hAnsi="Consolas"/>
+          <w:sz w:val="19"/>
+          <w:szCs w:val="19"/>
+        </w:rPr>
+        <w:t xml:space="preserve">      "rent": 40,</w:t>
+      </w:r>
+    </w:p>
+    <w:p>
+      <w:pPr>
+        <w:shd w:fill="F3F4F6" w:val="clear"/>
+        <w:spacing w:after="0" w:before="0"/>
+        <w:ind w:left="240" w:right="240"/>
+        <w:jc w:val="left"/>
+      </w:pPr>
+      <w:r>
+        <w:rPr>
+          <w:rFonts w:ascii="Consolas" w:cs="Consolas" w:eastAsia="Consolas" w:hAnsi="Consolas"/>
+          <w:sz w:val="19"/>
+          <w:szCs w:val="19"/>
+        </w:rPr>
+        <w:t xml:space="preserve">      "owner_id": null</w:t>
+      </w:r>
+    </w:p>
+    <w:p>
+      <w:pPr>
+        <w:shd w:fill="F3F4F6" w:val="clear"/>
+        <w:spacing w:after="0" w:before="0"/>
+        <w:ind w:left="240" w:right="240"/>
+        <w:jc w:val="left"/>
+      </w:pPr>
+      <w:r>
+        <w:rPr>
+          <w:rFonts w:ascii="Consolas" w:cs="Consolas" w:eastAsia="Consolas" w:hAnsi="Consolas"/>
+          <w:sz w:val="19"/>
+          <w:szCs w:val="19"/>
+        </w:rPr>
+        <w:t xml:space="preserve">    },</w:t>
+      </w:r>
+    </w:p>
+    <w:p>
+      <w:pPr>
+        <w:shd w:fill="F3F4F6" w:val="clear"/>
+        <w:spacing w:after="0" w:before="0"/>
+        <w:ind w:left="240" w:right="240"/>
+        <w:jc w:val="left"/>
+      </w:pPr>
+      <w:r>
+        <w:rPr>
+          <w:rFonts w:ascii="Consolas" w:cs="Consolas" w:eastAsia="Consolas" w:hAnsi="Consolas"/>
+          <w:sz w:val="19"/>
+          <w:szCs w:val="19"/>
+        </w:rPr>
+        <w:t xml:space="preserve">    {</w:t>
+      </w:r>
+    </w:p>
+    <w:p>
+      <w:pPr>
+        <w:shd w:fill="F3F4F6" w:val="clear"/>
+        <w:spacing w:after="0" w:before="0"/>
+        <w:ind w:left="240" w:right="240"/>
+        <w:jc w:val="left"/>
+      </w:pPr>
+      <w:r>
+        <w:rPr>
+          <w:rFonts w:ascii="Consolas" w:cs="Consolas" w:eastAsia="Consolas" w:hAnsi="Consolas"/>
+          <w:sz w:val="19"/>
+          <w:szCs w:val="19"/>
+        </w:rPr>
+        <w:t xml:space="preserve">      "id": 12,</w:t>
+      </w:r>
+    </w:p>
+    <w:p>
+      <w:pPr>
+        <w:shd w:fill="F3F4F6" w:val="clear"/>
+        <w:spacing w:after="0" w:before="0"/>
+        <w:ind w:left="240" w:right="240"/>
+        <w:jc w:val="left"/>
+      </w:pPr>
+      <w:r>
+        <w:rPr>
+          <w:rFonts w:ascii="Consolas" w:cs="Consolas" w:eastAsia="Consolas" w:hAnsi="Consolas"/>
+          <w:sz w:val="19"/>
+          <w:szCs w:val="19"/>
+        </w:rPr>
+        <w:t xml:space="preserve">      "name": "תיירות משגשגת",</w:t>
+      </w:r>
+    </w:p>
+    <w:p>
+      <w:pPr>
+        <w:shd w:fill="F3F4F6" w:val="clear"/>
+        <w:spacing w:after="0" w:before="0"/>
+        <w:ind w:left="240" w:right="240"/>
+        <w:jc w:val="left"/>
+      </w:pPr>
+      <w:r>
+        <w:rPr>
+          <w:rFonts w:ascii="Consolas" w:cs="Consolas" w:eastAsia="Consolas" w:hAnsi="Consolas"/>
+          <w:sz w:val="19"/>
+          <w:szCs w:val="19"/>
+        </w:rPr>
+        <w:t xml:space="preserve">      "type": "reward",</w:t>
+      </w:r>
+    </w:p>
+    <w:p>
+      <w:pPr>
+        <w:shd w:fill="F3F4F6" w:val="clear"/>
+        <w:spacing w:after="0" w:before="0"/>
+        <w:ind w:left="240" w:right="240"/>
+        <w:jc w:val="left"/>
+      </w:pPr>
+      <w:r>
+        <w:rPr>
+          <w:rFonts w:ascii="Consolas" w:cs="Consolas" w:eastAsia="Consolas" w:hAnsi="Consolas"/>
+          <w:sz w:val="19"/>
+          <w:szCs w:val="19"/>
+        </w:rPr>
+        <w:t xml:space="preserve">      "amount": 200</w:t>
+      </w:r>
+    </w:p>
+    <w:p>
+      <w:pPr>
+        <w:shd w:fill="F3F4F6" w:val="clear"/>
+        <w:spacing w:after="0" w:before="0"/>
+        <w:ind w:left="240" w:right="240"/>
+        <w:jc w:val="left"/>
+      </w:pPr>
+      <w:r>
+        <w:rPr>
+          <w:rFonts w:ascii="Consolas" w:cs="Consolas" w:eastAsia="Consolas" w:hAnsi="Consolas"/>
+          <w:sz w:val="19"/>
+          <w:szCs w:val="19"/>
+        </w:rPr>
+        <w:t xml:space="preserve">    },</w:t>
+      </w:r>
+    </w:p>
+    <w:p>
+      <w:pPr>
+        <w:shd w:fill="F3F4F6" w:val="clear"/>
+        <w:spacing w:after="0" w:before="0"/>
+        <w:ind w:left="240" w:right="240"/>
+        <w:jc w:val="left"/>
+      </w:pPr>
+      <w:r>
+        <w:rPr>
+          <w:rFonts w:ascii="Consolas" w:cs="Consolas" w:eastAsia="Consolas" w:hAnsi="Consolas"/>
+          <w:sz w:val="19"/>
+          <w:szCs w:val="19"/>
+        </w:rPr>
+        <w:t xml:space="preserve">    {</w:t>
+      </w:r>
+    </w:p>
+    <w:p>
+      <w:pPr>
+        <w:shd w:fill="F3F4F6" w:val="clear"/>
+        <w:spacing w:after="0" w:before="0"/>
+        <w:ind w:left="240" w:right="240"/>
+        <w:jc w:val="left"/>
+      </w:pPr>
+      <w:r>
+        <w:rPr>
+          <w:rFonts w:ascii="Consolas" w:cs="Consolas" w:eastAsia="Consolas" w:hAnsi="Consolas"/>
+          <w:sz w:val="19"/>
+          <w:szCs w:val="19"/>
+        </w:rPr>
+        <w:t xml:space="preserve">      "id": 13,</w:t>
+      </w:r>
+    </w:p>
+    <w:p>
+      <w:pPr>
+        <w:shd w:fill="F3F4F6" w:val="clear"/>
+        <w:spacing w:after="0" w:before="0"/>
+        <w:ind w:left="240" w:right="240"/>
+        <w:jc w:val="left"/>
+      </w:pPr>
+      <w:r>
+        <w:rPr>
+          <w:rFonts w:ascii="Consolas" w:cs="Consolas" w:eastAsia="Consolas" w:hAnsi="Consolas"/>
+          <w:sz w:val="19"/>
+          <w:szCs w:val="19"/>
+        </w:rPr>
+        <w:t xml:space="preserve">      "name": "דוחה",</w:t>
+      </w:r>
+    </w:p>
+    <w:p>
+      <w:pPr>
+        <w:shd w:fill="F3F4F6" w:val="clear"/>
+        <w:spacing w:after="0" w:before="0"/>
+        <w:ind w:left="240" w:right="240"/>
+        <w:jc w:val="left"/>
+      </w:pPr>
+      <w:r>
+        <w:rPr>
+          <w:rFonts w:ascii="Consolas" w:cs="Consolas" w:eastAsia="Consolas" w:hAnsi="Consolas"/>
+          <w:sz w:val="19"/>
+          <w:szCs w:val="19"/>
+        </w:rPr>
+        <w:t xml:space="preserve">      "type": "property",</w:t>
+      </w:r>
+    </w:p>
+    <w:p>
+      <w:pPr>
+        <w:shd w:fill="F3F4F6" w:val="clear"/>
+        <w:spacing w:after="0" w:before="0"/>
+        <w:ind w:left="240" w:right="240"/>
+        <w:jc w:val="left"/>
+      </w:pPr>
+      <w:r>
+        <w:rPr>
+          <w:rFonts w:ascii="Consolas" w:cs="Consolas" w:eastAsia="Consolas" w:hAnsi="Consolas"/>
+          <w:sz w:val="19"/>
+          <w:szCs w:val="19"/>
+        </w:rPr>
+        <w:t xml:space="preserve">      "price": 220,</w:t>
+      </w:r>
+    </w:p>
+    <w:p>
+      <w:pPr>
+        <w:shd w:fill="F3F4F6" w:val="clear"/>
+        <w:spacing w:after="0" w:before="0"/>
+        <w:ind w:left="240" w:right="240"/>
+        <w:jc w:val="left"/>
+      </w:pPr>
+      <w:r>
+        <w:rPr>
+          <w:rFonts w:ascii="Consolas" w:cs="Consolas" w:eastAsia="Consolas" w:hAnsi="Consolas"/>
+          <w:sz w:val="19"/>
+          <w:szCs w:val="19"/>
+        </w:rPr>
+        <w:t xml:space="preserve">      "rent": 44,</w:t>
+      </w:r>
+    </w:p>
+    <w:p>
+      <w:pPr>
+        <w:shd w:fill="F3F4F6" w:val="clear"/>
+        <w:spacing w:after="0" w:before="0"/>
+        <w:ind w:left="240" w:right="240"/>
+        <w:jc w:val="left"/>
+      </w:pPr>
+      <w:r>
+        <w:rPr>
+          <w:rFonts w:ascii="Consolas" w:cs="Consolas" w:eastAsia="Consolas" w:hAnsi="Consolas"/>
+          <w:sz w:val="19"/>
+          <w:szCs w:val="19"/>
+        </w:rPr>
+        <w:t xml:space="preserve">      "owner_id": null</w:t>
+      </w:r>
+    </w:p>
+    <w:p>
+      <w:pPr>
+        <w:shd w:fill="F3F4F6" w:val="clear"/>
+        <w:spacing w:after="0" w:before="0"/>
+        <w:ind w:left="240" w:right="240"/>
+        <w:jc w:val="left"/>
+      </w:pPr>
+      <w:r>
+        <w:rPr>
+          <w:rFonts w:ascii="Consolas" w:cs="Consolas" w:eastAsia="Consolas" w:hAnsi="Consolas"/>
+          <w:sz w:val="19"/>
+          <w:szCs w:val="19"/>
+        </w:rPr>
+        <w:t xml:space="preserve">    },</w:t>
+      </w:r>
+    </w:p>
+    <w:p>
+      <w:pPr>
+        <w:shd w:fill="F3F4F6" w:val="clear"/>
+        <w:spacing w:after="0" w:before="0"/>
+        <w:ind w:left="240" w:right="240"/>
+        <w:jc w:val="left"/>
+      </w:pPr>
+      <w:r>
+        <w:rPr>
+          <w:rFonts w:ascii="Consolas" w:cs="Consolas" w:eastAsia="Consolas" w:hAnsi="Consolas"/>
+          <w:sz w:val="19"/>
+          <w:szCs w:val="19"/>
+        </w:rPr>
+        <w:t xml:space="preserve">    {</w:t>
+      </w:r>
+    </w:p>
+    <w:p>
+      <w:pPr>
+        <w:shd w:fill="F3F4F6" w:val="clear"/>
+        <w:spacing w:after="0" w:before="0"/>
+        <w:ind w:left="240" w:right="240"/>
+        <w:jc w:val="left"/>
+      </w:pPr>
+      <w:r>
+        <w:rPr>
+          <w:rFonts w:ascii="Consolas" w:cs="Consolas" w:eastAsia="Consolas" w:hAnsi="Consolas"/>
+          <w:sz w:val="19"/>
+          <w:szCs w:val="19"/>
+        </w:rPr>
+        <w:t xml:space="preserve">      "id": 14,</w:t>
+      </w:r>
+    </w:p>
+    <w:p>
+      <w:pPr>
+        <w:shd w:fill="F3F4F6" w:val="clear"/>
+        <w:spacing w:after="0" w:before="0"/>
+        <w:ind w:left="240" w:right="240"/>
+        <w:jc w:val="left"/>
+      </w:pPr>
+      <w:r>
+        <w:rPr>
+          <w:rFonts w:ascii="Consolas" w:cs="Consolas" w:eastAsia="Consolas" w:hAnsi="Consolas"/>
+          <w:sz w:val="19"/>
+          <w:szCs w:val="19"/>
+        </w:rPr>
+        <w:t xml:space="preserve">      "name": "הפתעה בשוק",</w:t>
+      </w:r>
+    </w:p>
+    <w:p>
+      <w:pPr>
+        <w:shd w:fill="F3F4F6" w:val="clear"/>
+        <w:spacing w:after="0" w:before="0"/>
+        <w:ind w:left="240" w:right="240"/>
+        <w:jc w:val="left"/>
+      </w:pPr>
+      <w:r>
+        <w:rPr>
+          <w:rFonts w:ascii="Consolas" w:cs="Consolas" w:eastAsia="Consolas" w:hAnsi="Consolas"/>
+          <w:sz w:val="19"/>
+          <w:szCs w:val="19"/>
+        </w:rPr>
+        <w:t xml:space="preserve">      "type": "surprise"</w:t>
+      </w:r>
+    </w:p>
+    <w:p>
+      <w:pPr>
+        <w:shd w:fill="F3F4F6" w:val="clear"/>
+        <w:spacing w:after="0" w:before="0"/>
+        <w:ind w:left="240" w:right="240"/>
+        <w:jc w:val="left"/>
+      </w:pPr>
+      <w:r>
+        <w:rPr>
+          <w:rFonts w:ascii="Consolas" w:cs="Consolas" w:eastAsia="Consolas" w:hAnsi="Consolas"/>
+          <w:sz w:val="19"/>
+          <w:szCs w:val="19"/>
+        </w:rPr>
+        <w:t xml:space="preserve">    },</w:t>
+      </w:r>
+    </w:p>
+    <w:p>
+      <w:pPr>
+        <w:shd w:fill="F3F4F6" w:val="clear"/>
+        <w:spacing w:after="0" w:before="0"/>
+        <w:ind w:left="240" w:right="240"/>
+        <w:jc w:val="left"/>
+      </w:pPr>
+      <w:r>
+        <w:rPr>
+          <w:rFonts w:ascii="Consolas" w:cs="Consolas" w:eastAsia="Consolas" w:hAnsi="Consolas"/>
+          <w:sz w:val="19"/>
+          <w:szCs w:val="19"/>
+        </w:rPr>
+        <w:t xml:space="preserve">    {</w:t>
+      </w:r>
+    </w:p>
+    <w:p>
+      <w:pPr>
+        <w:shd w:fill="F3F4F6" w:val="clear"/>
+        <w:spacing w:after="0" w:before="0"/>
+        <w:ind w:left="240" w:right="240"/>
+        <w:jc w:val="left"/>
+      </w:pPr>
+      <w:r>
+        <w:rPr>
+          <w:rFonts w:ascii="Consolas" w:cs="Consolas" w:eastAsia="Consolas" w:hAnsi="Consolas"/>
+          <w:sz w:val="19"/>
+          <w:szCs w:val="19"/>
+        </w:rPr>
+        <w:t xml:space="preserve">      "id": 15,</w:t>
+      </w:r>
+    </w:p>
+    <w:p>
+      <w:pPr>
+        <w:shd w:fill="F3F4F6" w:val="clear"/>
+        <w:spacing w:after="0" w:before="0"/>
+        <w:ind w:left="240" w:right="240"/>
+        <w:jc w:val="left"/>
+      </w:pPr>
+      <w:r>
+        <w:rPr>
+          <w:rFonts w:ascii="Consolas" w:cs="Consolas" w:eastAsia="Consolas" w:hAnsi="Consolas"/>
+          <w:sz w:val="19"/>
+          <w:szCs w:val="19"/>
+        </w:rPr>
+        <w:t xml:space="preserve">      "name": "מס יוקרה",</w:t>
+      </w:r>
+    </w:p>
+    <w:p>
+      <w:pPr>
+        <w:shd w:fill="F3F4F6" w:val="clear"/>
+        <w:spacing w:after="0" w:before="0"/>
+        <w:ind w:left="240" w:right="240"/>
+        <w:jc w:val="left"/>
+      </w:pPr>
+      <w:r>
+        <w:rPr>
+          <w:rFonts w:ascii="Consolas" w:cs="Consolas" w:eastAsia="Consolas" w:hAnsi="Consolas"/>
+          <w:sz w:val="19"/>
+          <w:szCs w:val="19"/>
+        </w:rPr>
+        <w:t xml:space="preserve">      "type": "penalty",</w:t>
+      </w:r>
+    </w:p>
+    <w:p>
+      <w:pPr>
+        <w:shd w:fill="F3F4F6" w:val="clear"/>
+        <w:spacing w:after="0" w:before="0"/>
+        <w:ind w:left="240" w:right="240"/>
+        <w:jc w:val="left"/>
+      </w:pPr>
+      <w:r>
+        <w:rPr>
+          <w:rFonts w:ascii="Consolas" w:cs="Consolas" w:eastAsia="Consolas" w:hAnsi="Consolas"/>
+          <w:sz w:val="19"/>
+          <w:szCs w:val="19"/>
+        </w:rPr>
+        <w:t xml:space="preserve">      "amount": 650</w:t>
+      </w:r>
+    </w:p>
+    <w:p>
+      <w:pPr>
+        <w:shd w:fill="F3F4F6" w:val="clear"/>
+        <w:spacing w:after="0" w:before="0"/>
+        <w:ind w:left="240" w:right="240"/>
+        <w:jc w:val="left"/>
+      </w:pPr>
+      <w:r>
+        <w:rPr>
+          <w:rFonts w:ascii="Consolas" w:cs="Consolas" w:eastAsia="Consolas" w:hAnsi="Consolas"/>
+          <w:sz w:val="19"/>
+          <w:szCs w:val="19"/>
+        </w:rPr>
+        <w:t xml:space="preserve">    }</w:t>
       </w:r>
     </w:p>
     <w:p>
@@ -1110,7 +3046,39 @@
           <w:sz w:val="19"/>
           <w:szCs w:val="19"/>
         </w:rPr>
-        <w:t xml:space="preserve">  "event_log": ["Game created. Roll to begin."]</w:t>
+        <w:t xml:space="preserve">  "event_log": [</w:t>
+      </w:r>
+    </w:p>
+    <w:p>
+      <w:pPr>
+        <w:shd w:fill="F3F4F6" w:val="clear"/>
+        <w:spacing w:after="0" w:before="0"/>
+        <w:ind w:left="240" w:right="240"/>
+        <w:jc w:val="left"/>
+      </w:pPr>
+      <w:r>
+        <w:rPr>
+          <w:rFonts w:ascii="Consolas" w:cs="Consolas" w:eastAsia="Consolas" w:hAnsi="Consolas"/>
+          <w:sz w:val="19"/>
+          <w:szCs w:val="19"/>
+        </w:rPr>
+        <w:t xml:space="preserve">    "Game created. Roll to begin."</w:t>
+      </w:r>
+    </w:p>
+    <w:p>
+      <w:pPr>
+        <w:shd w:fill="F3F4F6" w:val="clear"/>
+        <w:spacing w:after="0" w:before="0"/>
+        <w:ind w:left="240" w:right="240"/>
+        <w:jc w:val="left"/>
+      </w:pPr>
+      <w:r>
+        <w:rPr>
+          <w:rFonts w:ascii="Consolas" w:cs="Consolas" w:eastAsia="Consolas" w:hAnsi="Consolas"/>
+          <w:sz w:val="19"/>
+          <w:szCs w:val="19"/>
+        </w:rPr>
+        <w:t xml:space="preserve">  ]</w:t>
       </w:r>
     </w:p>
     <w:p>
@@ -1127,24 +3095,6 @@
           <w:szCs w:val="19"/>
         </w:rPr>
         <w:t xml:space="preserve">}</w:t>
-      </w:r>
-    </w:p>
-    <w:p>
-      <w:pPr>
-        <w:bidi/>
-        <w:spacing w:after="120" w:line="300"/>
-        <w:jc w:val="right"/>
-      </w:pPr>
-      <w:r>
-        <w:rPr>
-          <w:rFonts w:ascii="Arial" w:cs="Arial" w:eastAsia="Arial" w:hAnsi="Arial"/>
-          <w:b/>
-          <w:bCs/>
-          <w:color w:val="1E3A5F"/>
-          <w:rtl/>
-          <w:lang w:bidi="he-IL"/>
-        </w:rPr>
-        <w:t xml:space="preserve">בדוגמה מוצגות רק שתי משבצות כדי לשמור על קריאות. בתשובה אמיתית board חייבת להכיל 16 משבצות עם id רציף מ-0 עד 15.</w:t>
       </w:r>
     </w:p>
     <w:p>

</xml_diff>